<commit_message>
Add MCP Gateway and RLS instructions; fix billing doc paths
New developer instructions saved in the standard three-format scheme
(.md/.html/.docx): MCP Gateway client onboarding (vendor-facing Part I
+ internal ИБ Part II, clearly separated in the HTML), and row/column
-level security (RLS) setup for DataStewards. Deduplicated a repeated
"Возможные ошибки" section in the MCP Gateway source and corrected its
step references.

Also corrected two small inaccuracies in the token-limits/billing guide
per a corrected re-upload: full navigation breadcrumbs in the "карта
документа" table, and "сотрудник ИБ" instead of "офицер ИБ".

Co-Authored-By: Claude Sonnet 5 <noreply@anthropic.com>
Claude-Session: https://claude.ai/code/session_01DpSN8JwCJ3tg3JVUadr2zE
</commit_message>
<xml_diff>
--- a/docs/analysis/instrukciya-limity-tokenov-i-billing.docx
+++ b/docs/analysis/instrukciya-limity-tokenov-i-billing.docx
@@ -252,7 +252,7 @@
               <w:spacing w:after="0"/>
             </w:pPr>
             <w:r>
-              <w:t xml:space="preserve">Пользователи и доступ</w:t>
+              <w:t xml:space="preserve">Администрирование → Рабочее место ИБ → Пользователи и доступ</w:t>
             </w:r>
           </w:p>
         </w:tc>
@@ -329,7 +329,7 @@
               <w:spacing w:after="0"/>
             </w:pPr>
             <w:r>
-              <w:t xml:space="preserve">Лимиты команд</w:t>
+              <w:t xml:space="preserve">Администрирование → Рабочее место ИБ → Лимиты команд</w:t>
             </w:r>
           </w:p>
         </w:tc>
@@ -406,7 +406,7 @@
               <w:spacing w:after="0"/>
             </w:pPr>
             <w:r>
-              <w:t xml:space="preserve">Потребление токенов</w:t>
+              <w:t xml:space="preserve">Администрирование → Рабочее место ИБ → Потребление токенов</w:t>
             </w:r>
           </w:p>
         </w:tc>
@@ -1544,7 +1544,7 @@
         <w:spacing w:after="130"/>
       </w:pPr>
       <w:r>
-        <w:t xml:space="preserve">Доступ к этим экранам есть у роли администратора и офицера ИБ.</w:t>
+        <w:t xml:space="preserve">Доступ к этим экранам есть у роли администратора и сотрудника ИБ.</w:t>
       </w:r>
     </w:p>
     <w:p>

</xml_diff>